<commit_message>
update turning comparison file
</commit_message>
<xml_diff>
--- a/results/tuning_comparison.docx
+++ b/results/tuning_comparison.docx
@@ -14,21 +14,7 @@
           <w:color w:val="EE0000"/>
           <w:lang w:eastAsia="zh-TW"/>
         </w:rPr>
-        <w:t>p_effect_threshold = 0.</w:t>
-      </w:r>
-      <w:r>
-        <w:rPr>
-          <w:color w:val="EE0000"/>
-          <w:lang w:eastAsia="zh-TW"/>
-        </w:rPr>
-        <w:t>7</w:t>
-      </w:r>
-      <w:r>
-        <w:rPr>
-          <w:color w:val="EE0000"/>
-          <w:lang w:eastAsia="zh-TW"/>
-        </w:rPr>
-        <w:t>0, guard_days = 4</w:t>
+        <w:t>p_effect_threshold = 0.70, guard_days = 4</w:t>
       </w:r>
     </w:p>
     <w:p>
@@ -759,6 +745,8 @@
     <w:p>
       <w:pPr>
         <w:rPr>
+          <w:b/>
+          <w:bCs/>
           <w:lang w:eastAsia="zh-TW"/>
         </w:rPr>
       </w:pPr>
@@ -921,7 +909,19 @@
         <w:rPr>
           <w:lang w:eastAsia="zh-TW"/>
         </w:rPr>
-        <w:t>p_effect_threshold = 0.80, guard_days = 4</w:t>
+        <w:t>p_effect_threshold = 0.</w:t>
+      </w:r>
+      <w:r>
+        <w:rPr>
+          <w:lang w:eastAsia="zh-TW"/>
+        </w:rPr>
+        <w:t>7</w:t>
+      </w:r>
+      <w:r>
+        <w:rPr>
+          <w:lang w:eastAsia="zh-TW"/>
+        </w:rPr>
+        <w:t>0, guard_days = 4</w:t>
       </w:r>
     </w:p>
     <w:p>
@@ -1077,11 +1077,30 @@
           <w:lang w:eastAsia="zh-TW"/>
         </w:rPr>
       </w:pPr>
-      <w:r>
-        <w:rPr>
-          <w:lang w:eastAsia="zh-TW"/>
-        </w:rPr>
-        <w:t xml:space="preserve">p_effect_threshold = 0.80, guard_days = </w:t>
+    </w:p>
+    <w:p>
+      <w:pPr>
+        <w:rPr>
+          <w:lang w:eastAsia="zh-TW"/>
+        </w:rPr>
+      </w:pPr>
+      <w:r>
+        <w:rPr>
+          <w:lang w:eastAsia="zh-TW"/>
+        </w:rPr>
+        <w:t>p_effect_threshold = 0.</w:t>
+      </w:r>
+      <w:r>
+        <w:rPr>
+          <w:lang w:eastAsia="zh-TW"/>
+        </w:rPr>
+        <w:t>7</w:t>
+      </w:r>
+      <w:r>
+        <w:rPr>
+          <w:lang w:eastAsia="zh-TW"/>
+        </w:rPr>
+        <w:t xml:space="preserve">0, guard_days = </w:t>
       </w:r>
       <w:r>
         <w:rPr>
@@ -1093,7 +1112,6 @@
     <w:p>
       <w:pPr>
         <w:rPr>
-          <w:rFonts w:hint="eastAsia"/>
           <w:lang w:eastAsia="zh-TW"/>
         </w:rPr>
       </w:pPr>
@@ -1144,6 +1162,105 @@
           <w:lang w:eastAsia="zh-TW"/>
         </w:rPr>
       </w:pPr>
+    </w:p>
+    <w:p>
+      <w:pPr>
+        <w:rPr>
+          <w:lang w:eastAsia="zh-TW"/>
+        </w:rPr>
+      </w:pPr>
+      <w:r>
+        <w:rPr>
+          <w:lang w:eastAsia="zh-TW"/>
+        </w:rPr>
+        <w:t>Plots:</w:t>
+      </w:r>
+    </w:p>
+    <w:p>
+      <w:pPr>
+        <w:rPr>
+          <w:lang w:eastAsia="zh-TW"/>
+        </w:rPr>
+      </w:pPr>
+      <w:r>
+        <w:rPr>
+          <w:lang w:eastAsia="zh-TW"/>
+        </w:rPr>
+        <w:t>X-axis: p_effect_threshold (</w:t>
+      </w:r>
+      <w:r>
+        <w:rPr>
+          <w:lang w:eastAsia="zh-TW"/>
+        </w:rPr>
+        <w:t>0.6 – 0.9,</w:t>
+      </w:r>
+      <w:r>
+        <w:rPr>
+          <w:lang w:eastAsia="zh-TW"/>
+        </w:rPr>
+        <w:t xml:space="preserve"> increment: 0.05), y-axis: detection rate</w:t>
+      </w:r>
+      <w:r>
+        <w:rPr>
+          <w:lang w:eastAsia="zh-TW"/>
+        </w:rPr>
+        <w:t xml:space="preserve">, false alarm rate, </w:t>
+      </w:r>
+      <w:r>
+        <w:rPr>
+          <w:lang w:eastAsia="zh-TW"/>
+        </w:rPr>
+        <w:t>tau_within_tolerance_rate</w:t>
+      </w:r>
+    </w:p>
+    <w:p>
+      <w:pPr>
+        <w:rPr>
+          <w:lang w:eastAsia="zh-TW"/>
+        </w:rPr>
+      </w:pPr>
+      <w:r>
+        <w:rPr>
+          <w:lang w:eastAsia="zh-TW"/>
+        </w:rPr>
+        <w:t>X-axis: guard days (</w:t>
+      </w:r>
+      <w:r>
+        <w:rPr>
+          <w:lang w:eastAsia="zh-TW"/>
+        </w:rPr>
+        <w:t xml:space="preserve">4, </w:t>
+      </w:r>
+      <w:r>
+        <w:rPr>
+          <w:lang w:eastAsia="zh-TW"/>
+        </w:rPr>
+        <w:t xml:space="preserve">5, </w:t>
+      </w:r>
+      <w:r>
+        <w:rPr>
+          <w:lang w:eastAsia="zh-TW"/>
+        </w:rPr>
+        <w:t>6</w:t>
+      </w:r>
+      <w:r>
+        <w:rPr>
+          <w:lang w:eastAsia="zh-TW"/>
+        </w:rPr>
+        <w:t>)</w:t>
+      </w:r>
+      <w:r>
+        <w:rPr>
+          <w:lang w:eastAsia="zh-TW"/>
+        </w:rPr>
+        <w:t xml:space="preserve"> </w:t>
+      </w:r>
+      <w:r>
+        <w:rPr>
+          <w:lang w:eastAsia="zh-TW"/>
+        </w:rPr>
+        <w:t xml:space="preserve"> </w:t>
+      </w:r>
     </w:p>
     <w:sectPr>
       <w:pgSz w:w="15840" w:h="12240" w:orient="landscape"/>

</xml_diff>

<commit_message>
add comparison results and plots
</commit_message>
<xml_diff>
--- a/results/tuning_comparison.docx
+++ b/results/tuning_comparison.docx
@@ -1,6 +1,6 @@
 
 <file path=word/document.xml><?xml version="1.0" encoding="utf-8"?>
-<w:document xmlns:wpc="http://schemas.microsoft.com/office/word/2010/wordprocessingCanvas" xmlns:cx="http://schemas.microsoft.com/office/drawing/2014/chartex" xmlns:cx1="http://schemas.microsoft.com/office/drawing/2015/9/8/chartex" xmlns:cx2="http://schemas.microsoft.com/office/drawing/2015/10/21/chartex" xmlns:cx3="http://schemas.microsoft.com/office/drawing/2016/5/9/chartex" xmlns:cx4="http://schemas.microsoft.com/office/drawing/2016/5/10/chartex" xmlns:cx5="http://schemas.microsoft.com/office/drawing/2016/5/11/chartex" xmlns:cx6="http://schemas.microsoft.com/office/drawing/2016/5/12/chartex" xmlns:cx7="http://schemas.microsoft.com/office/drawing/2016/5/13/chartex" xmlns:cx8="http://schemas.microsoft.com/office/drawing/2016/5/14/chartex" xmlns:mc="http://schemas.openxmlformats.org/markup-compatibility/2006" xmlns:aink="http://schemas.microsoft.com/office/drawing/2016/ink" xmlns:am3d="http://schemas.microsoft.com/office/drawing/2017/model3d" xmlns:o="urn:schemas-microsoft-com:office:office" xmlns:oel="http://schemas.microsoft.com/office/2019/extlst" xmlns:r="http://schemas.openxmlformats.org/officeDocument/2006/relationships" xmlns:m="http://schemas.openxmlformats.org/officeDocument/2006/math" xmlns:v="urn:schemas-microsoft-com:vml" xmlns:wp14="http://schemas.microsoft.com/office/word/2010/wordprocessingDrawing" xmlns:wp="http://schemas.openxmlformats.org/drawingml/2006/wordprocessingDrawing" xmlns:w10="urn:schemas-microsoft-com:office:word" xmlns:w="http://schemas.openxmlformats.org/wordprocessingml/2006/main" xmlns:w14="http://schemas.microsoft.com/office/word/2010/wordml" xmlns:w15="http://schemas.microsoft.com/office/word/2012/wordml" xmlns:w16cex="http://schemas.microsoft.com/office/word/2018/wordml/cex" xmlns:w16cid="http://schemas.microsoft.com/office/word/2016/wordml/cid" xmlns:w16="http://schemas.microsoft.com/office/word/2018/wordml" xmlns:w16du="http://schemas.microsoft.com/office/word/2023/wordml/word16du" xmlns:w16sdtdh="http://schemas.microsoft.com/office/word/2020/wordml/sdtdatahash" xmlns:w16sdtfl="http://schemas.microsoft.com/office/word/2024/wordml/sdtformatlock" xmlns:w16se="http://schemas.microsoft.com/office/word/2015/wordml/symex" xmlns:wpg="http://schemas.microsoft.com/office/word/2010/wordprocessingGroup" xmlns:wpi="http://schemas.microsoft.com/office/word/2010/wordprocessingInk" xmlns:wne="http://schemas.microsoft.com/office/word/2006/wordml" xmlns:wps="http://schemas.microsoft.com/office/word/2010/wordprocessingShape" mc:Ignorable="w14 w15 w16se w16cid w16 w16cex w16sdtdh w16sdtfl w16du wp14">
+<w:document xmlns:wpc="http://schemas.microsoft.com/office/word/2010/wordprocessingCanvas" xmlns:cx="http://schemas.microsoft.com/office/drawing/2014/chartex" xmlns:cx1="http://schemas.microsoft.com/office/drawing/2015/9/8/chartex" xmlns:cx2="http://schemas.microsoft.com/office/drawing/2015/10/21/chartex" xmlns:cx3="http://schemas.microsoft.com/office/drawing/2016/5/9/chartex" xmlns:cx4="http://schemas.microsoft.com/office/drawing/2016/5/10/chartex" xmlns:cx5="http://schemas.microsoft.com/office/drawing/2016/5/11/chartex" xmlns:cx6="http://schemas.microsoft.com/office/drawing/2016/5/12/chartex" xmlns:cx7="http://schemas.microsoft.com/office/drawing/2016/5/13/chartex" xmlns:cx8="http://schemas.microsoft.com/office/drawing/2016/5/14/chartex" xmlns:mc="http://schemas.openxmlformats.org/markup-compatibility/2006" xmlns:aink="http://schemas.microsoft.com/office/drawing/2016/ink" xmlns:am3d="http://schemas.microsoft.com/office/drawing/2017/model3d" xmlns:o="urn:schemas-microsoft-com:office:office" xmlns:oel="http://schemas.microsoft.com/office/2019/extlst" xmlns:r="http://schemas.openxmlformats.org/officeDocument/2006/relationships" xmlns:m="http://schemas.openxmlformats.org/officeDocument/2006/math" xmlns:v="urn:schemas-microsoft-com:vml" xmlns:wp14="http://schemas.microsoft.com/office/word/2010/wordprocessingDrawing" xmlns:wp="http://schemas.openxmlformats.org/drawingml/2006/wordprocessingDrawing" xmlns:w10="urn:schemas-microsoft-com:office:word" xmlns:w="http://schemas.openxmlformats.org/wordprocessingml/2006/main" xmlns:w14="http://schemas.microsoft.com/office/word/2010/wordml" xmlns:w15="http://schemas.microsoft.com/office/word/2012/wordml" xmlns:w16cei="http://schemas.microsoft.com/office/word/2026/wordml/cei" xmlns:w16cex="http://schemas.microsoft.com/office/word/2018/wordml/cex" xmlns:w16cid="http://schemas.microsoft.com/office/word/2016/wordml/cid" xmlns:w16="http://schemas.microsoft.com/office/word/2018/wordml" xmlns:w16du="http://schemas.microsoft.com/office/word/2023/wordml/word16du" xmlns:w16sdtdh="http://schemas.microsoft.com/office/word/2020/wordml/sdtdatahash" xmlns:w16sdtfl="http://schemas.microsoft.com/office/word/2024/wordml/sdtformatlock" xmlns:w16se="http://schemas.microsoft.com/office/word/2015/wordml/symex" xmlns:wpg="http://schemas.microsoft.com/office/word/2010/wordprocessingGroup" xmlns:wpi="http://schemas.microsoft.com/office/word/2010/wordprocessingInk" xmlns:wne="http://schemas.microsoft.com/office/word/2006/wordml" xmlns:wps="http://schemas.microsoft.com/office/word/2010/wordprocessingShape" mc:Ignorable="w14 w15 w16se w16cid w16 w16cex w16sdtdh w16sdtfl w16du wp14">
   <w:body>
     <w:p>
       <w:pPr>
@@ -703,50 +703,406 @@
     <w:p>
       <w:pPr>
         <w:rPr>
-          <w:lang w:eastAsia="zh-TW"/>
-        </w:rPr>
-      </w:pPr>
-    </w:p>
-    <w:p>
-      <w:pPr>
-        <w:rPr>
-          <w:lang w:eastAsia="zh-TW"/>
-        </w:rPr>
-      </w:pPr>
-    </w:p>
-    <w:p>
-      <w:pPr>
-        <w:rPr>
-          <w:lang w:eastAsia="zh-TW"/>
-        </w:rPr>
-      </w:pPr>
-    </w:p>
-    <w:p>
-      <w:pPr>
-        <w:rPr>
-          <w:lang w:eastAsia="zh-TW"/>
-        </w:rPr>
-      </w:pPr>
-    </w:p>
-    <w:p>
-      <w:pPr>
-        <w:rPr>
-          <w:lang w:eastAsia="zh-TW"/>
-        </w:rPr>
-      </w:pPr>
-    </w:p>
-    <w:p>
-      <w:pPr>
-        <w:rPr>
-          <w:lang w:eastAsia="zh-TW"/>
-        </w:rPr>
-      </w:pPr>
-    </w:p>
-    <w:p>
-      <w:pPr>
-        <w:rPr>
           <w:b/>
           <w:bCs/>
+          <w:lang w:eastAsia="zh-TW"/>
+        </w:rPr>
+      </w:pPr>
+      <w:r>
+        <w:rPr>
+          <w:rFonts w:hint="eastAsia"/>
+          <w:b/>
+          <w:bCs/>
+          <w:lang w:eastAsia="zh-TW"/>
+        </w:rPr>
+        <w:t>Main run, p_effect_threshold=0.7, guard_days = 5</w:t>
+      </w:r>
+    </w:p>
+    <w:p>
+      <w:pPr>
+        <w:spacing w:after="0"/>
+        <w:rPr>
+          <w:lang w:eastAsia="zh-TW"/>
+        </w:rPr>
+      </w:pPr>
+      <w:r>
+        <w:rPr>
+          <w:rFonts w:hint="eastAsia"/>
+          <w:lang w:eastAsia="zh-TW"/>
+        </w:rPr>
+        <w:t xml:space="preserve">n_reps  theta1  theta2  </w:t>
+      </w:r>
+      <w:r>
+        <w:rPr>
+          <w:lang w:eastAsia="zh-TW"/>
+        </w:rPr>
+        <w:t xml:space="preserve">  </w:t>
+      </w:r>
+      <w:r>
+        <w:rPr>
+          <w:rFonts w:hint="eastAsia"/>
+          <w:lang w:eastAsia="zh-TW"/>
+        </w:rPr>
+        <w:t xml:space="preserve">t_star  </w:t>
+      </w:r>
+      <w:r>
+        <w:rPr>
+          <w:lang w:eastAsia="zh-TW"/>
+        </w:rPr>
+        <w:t xml:space="preserve"> </w:t>
+      </w:r>
+      <w:r>
+        <w:rPr>
+          <w:rFonts w:hint="eastAsia"/>
+          <w:lang w:eastAsia="zh-TW"/>
+        </w:rPr>
+        <w:t>detection_rate  false_alarm_rate  median_detection_delay  median_abs_tau_error</w:t>
+      </w:r>
+      <w:r>
+        <w:rPr>
+          <w:lang w:eastAsia="zh-TW"/>
+        </w:rPr>
+        <w:t xml:space="preserve">    </w:t>
+      </w:r>
+      <w:r>
+        <w:rPr>
+          <w:rFonts w:hint="eastAsia"/>
+          <w:lang w:eastAsia="zh-TW"/>
+        </w:rPr>
+        <w:t xml:space="preserve">tau_within_tolerance_rate </w:t>
+      </w:r>
+    </w:p>
+    <w:p>
+      <w:pPr>
+        <w:rPr>
+          <w:lang w:eastAsia="zh-TW"/>
+        </w:rPr>
+      </w:pPr>
+      <w:r>
+        <w:rPr>
+          <w:rFonts w:hint="eastAsia"/>
+          <w:lang w:eastAsia="zh-TW"/>
+        </w:rPr>
+        <w:t xml:space="preserve">50       </w:t>
+      </w:r>
+      <w:r>
+        <w:rPr>
+          <w:lang w:eastAsia="zh-TW"/>
+        </w:rPr>
+        <w:t xml:space="preserve">      </w:t>
+      </w:r>
+      <w:r>
+        <w:rPr>
+          <w:rFonts w:hint="eastAsia"/>
+          <w:lang w:eastAsia="zh-TW"/>
+        </w:rPr>
+        <w:t xml:space="preserve">0.15       0.25         </w:t>
+      </w:r>
+      <w:r>
+        <w:rPr>
+          <w:lang w:eastAsia="zh-TW"/>
+        </w:rPr>
+        <w:t xml:space="preserve">   </w:t>
+      </w:r>
+      <w:r>
+        <w:rPr>
+          <w:rFonts w:hint="eastAsia"/>
+          <w:lang w:eastAsia="zh-TW"/>
+        </w:rPr>
+        <w:t xml:space="preserve">30          </w:t>
+      </w:r>
+      <w:r>
+        <w:rPr>
+          <w:lang w:eastAsia="zh-TW"/>
+        </w:rPr>
+        <w:t xml:space="preserve">    </w:t>
+      </w:r>
+      <w:r>
+        <w:rPr>
+          <w:rFonts w:hint="eastAsia"/>
+          <w:lang w:eastAsia="zh-TW"/>
+        </w:rPr>
+        <w:t xml:space="preserve">0.98              </w:t>
+      </w:r>
+      <w:r>
+        <w:rPr>
+          <w:lang w:eastAsia="zh-TW"/>
+        </w:rPr>
+        <w:t xml:space="preserve">         </w:t>
+      </w:r>
+      <w:r>
+        <w:rPr>
+          <w:rFonts w:hint="eastAsia"/>
+          <w:lang w:eastAsia="zh-TW"/>
+        </w:rPr>
+        <w:t>0.</w:t>
+      </w:r>
+      <w:r>
+        <w:rPr>
+          <w:rFonts w:hint="eastAsia"/>
+          <w:lang w:eastAsia="zh-TW"/>
+        </w:rPr>
+        <w:t>22</w:t>
+      </w:r>
+      <w:r>
+        <w:rPr>
+          <w:rFonts w:hint="eastAsia"/>
+          <w:lang w:eastAsia="zh-TW"/>
+        </w:rPr>
+        <w:t xml:space="preserve">                    </w:t>
+      </w:r>
+      <w:r>
+        <w:rPr>
+          <w:lang w:eastAsia="zh-TW"/>
+        </w:rPr>
+        <w:t xml:space="preserve">                  </w:t>
+      </w:r>
+      <w:r>
+        <w:rPr>
+          <w:rFonts w:hint="eastAsia"/>
+          <w:lang w:eastAsia="zh-TW"/>
+        </w:rPr>
+        <w:t xml:space="preserve">10.0                   </w:t>
+      </w:r>
+      <w:r>
+        <w:rPr>
+          <w:lang w:eastAsia="zh-TW"/>
+        </w:rPr>
+        <w:t xml:space="preserve">                            </w:t>
+      </w:r>
+      <w:r>
+        <w:rPr>
+          <w:rFonts w:hint="eastAsia"/>
+          <w:lang w:eastAsia="zh-TW"/>
+        </w:rPr>
+        <w:t xml:space="preserve">5.0                    </w:t>
+      </w:r>
+      <w:r>
+        <w:rPr>
+          <w:lang w:eastAsia="zh-TW"/>
+        </w:rPr>
+        <w:t xml:space="preserve">                      </w:t>
+      </w:r>
+      <w:r>
+        <w:rPr>
+          <w:rFonts w:hint="eastAsia"/>
+          <w:lang w:eastAsia="zh-TW"/>
+        </w:rPr>
+        <w:t>0.22449</w:t>
+      </w:r>
+    </w:p>
+    <w:p>
+      <w:pPr>
+        <w:rPr>
+          <w:b/>
+          <w:bCs/>
+          <w:lang w:eastAsia="zh-TW"/>
+        </w:rPr>
+      </w:pPr>
+      <w:r>
+        <w:rPr>
+          <w:rFonts w:hint="eastAsia"/>
+          <w:b/>
+          <w:bCs/>
+          <w:lang w:eastAsia="zh-TW"/>
+        </w:rPr>
+        <w:t xml:space="preserve">Main run, p_effect_threshold=0.7, guard_days = </w:t>
+      </w:r>
+      <w:r>
+        <w:rPr>
+          <w:rFonts w:hint="eastAsia"/>
+          <w:b/>
+          <w:bCs/>
+          <w:lang w:eastAsia="zh-TW"/>
+        </w:rPr>
+        <w:t>6</w:t>
+      </w:r>
+    </w:p>
+    <w:p>
+      <w:pPr>
+        <w:spacing w:after="0"/>
+        <w:rPr>
+          <w:lang w:eastAsia="zh-TW"/>
+        </w:rPr>
+      </w:pPr>
+      <w:r>
+        <w:rPr>
+          <w:rFonts w:hint="eastAsia"/>
+          <w:lang w:eastAsia="zh-TW"/>
+        </w:rPr>
+        <w:t xml:space="preserve">n_reps  theta1  theta2  </w:t>
+      </w:r>
+      <w:r>
+        <w:rPr>
+          <w:lang w:eastAsia="zh-TW"/>
+        </w:rPr>
+        <w:t xml:space="preserve">  </w:t>
+      </w:r>
+      <w:r>
+        <w:rPr>
+          <w:rFonts w:hint="eastAsia"/>
+          <w:lang w:eastAsia="zh-TW"/>
+        </w:rPr>
+        <w:t xml:space="preserve">t_star  </w:t>
+      </w:r>
+      <w:r>
+        <w:rPr>
+          <w:lang w:eastAsia="zh-TW"/>
+        </w:rPr>
+        <w:t xml:space="preserve"> </w:t>
+      </w:r>
+      <w:r>
+        <w:rPr>
+          <w:rFonts w:hint="eastAsia"/>
+          <w:lang w:eastAsia="zh-TW"/>
+        </w:rPr>
+        <w:t>detection_rate  false_alarm_rate  median_detection_delay  median_abs_tau_error</w:t>
+      </w:r>
+      <w:r>
+        <w:rPr>
+          <w:lang w:eastAsia="zh-TW"/>
+        </w:rPr>
+        <w:t xml:space="preserve">    </w:t>
+      </w:r>
+      <w:r>
+        <w:rPr>
+          <w:rFonts w:hint="eastAsia"/>
+          <w:lang w:eastAsia="zh-TW"/>
+        </w:rPr>
+        <w:t xml:space="preserve">tau_within_tolerance_rate </w:t>
+      </w:r>
+    </w:p>
+    <w:p>
+      <w:pPr>
+        <w:rPr>
+          <w:rFonts w:hint="eastAsia"/>
+          <w:lang w:eastAsia="zh-TW"/>
+        </w:rPr>
+      </w:pPr>
+      <w:r>
+        <w:rPr>
+          <w:rFonts w:hint="eastAsia"/>
+          <w:lang w:eastAsia="zh-TW"/>
+        </w:rPr>
+        <w:t xml:space="preserve">50       </w:t>
+      </w:r>
+      <w:r>
+        <w:rPr>
+          <w:lang w:eastAsia="zh-TW"/>
+        </w:rPr>
+        <w:t xml:space="preserve">      </w:t>
+      </w:r>
+      <w:r>
+        <w:rPr>
+          <w:rFonts w:hint="eastAsia"/>
+          <w:lang w:eastAsia="zh-TW"/>
+        </w:rPr>
+        <w:t xml:space="preserve">0.15       0.25         </w:t>
+      </w:r>
+      <w:r>
+        <w:rPr>
+          <w:lang w:eastAsia="zh-TW"/>
+        </w:rPr>
+        <w:t xml:space="preserve">   </w:t>
+      </w:r>
+      <w:r>
+        <w:rPr>
+          <w:rFonts w:hint="eastAsia"/>
+          <w:lang w:eastAsia="zh-TW"/>
+        </w:rPr>
+        <w:t xml:space="preserve">30          </w:t>
+      </w:r>
+      <w:r>
+        <w:rPr>
+          <w:lang w:eastAsia="zh-TW"/>
+        </w:rPr>
+        <w:t xml:space="preserve">    </w:t>
+      </w:r>
+      <w:r>
+        <w:rPr>
+          <w:rFonts w:hint="eastAsia"/>
+          <w:lang w:eastAsia="zh-TW"/>
+        </w:rPr>
+        <w:t xml:space="preserve">0.98              </w:t>
+      </w:r>
+      <w:r>
+        <w:rPr>
+          <w:lang w:eastAsia="zh-TW"/>
+        </w:rPr>
+        <w:t xml:space="preserve">         </w:t>
+      </w:r>
+      <w:r>
+        <w:rPr>
+          <w:rFonts w:hint="eastAsia"/>
+          <w:lang w:eastAsia="zh-TW"/>
+        </w:rPr>
+        <w:t>0.</w:t>
+      </w:r>
+      <w:r>
+        <w:rPr>
+          <w:rFonts w:hint="eastAsia"/>
+          <w:lang w:eastAsia="zh-TW"/>
+        </w:rPr>
+        <w:t>1</w:t>
+      </w:r>
+      <w:r>
+        <w:rPr>
+          <w:rFonts w:hint="eastAsia"/>
+          <w:lang w:eastAsia="zh-TW"/>
+        </w:rPr>
+        <w:t xml:space="preserve">                    </w:t>
+      </w:r>
+      <w:r>
+        <w:rPr>
+          <w:lang w:eastAsia="zh-TW"/>
+        </w:rPr>
+        <w:t xml:space="preserve">                  </w:t>
+      </w:r>
+      <w:r>
+        <w:rPr>
+          <w:rFonts w:hint="eastAsia"/>
+          <w:lang w:eastAsia="zh-TW"/>
+        </w:rPr>
+        <w:t xml:space="preserve">10.0                   </w:t>
+      </w:r>
+      <w:r>
+        <w:rPr>
+          <w:lang w:eastAsia="zh-TW"/>
+        </w:rPr>
+        <w:t xml:space="preserve">                            </w:t>
+      </w:r>
+      <w:r>
+        <w:rPr>
+          <w:rFonts w:hint="eastAsia"/>
+          <w:lang w:eastAsia="zh-TW"/>
+        </w:rPr>
+        <w:t xml:space="preserve">5.0                    </w:t>
+      </w:r>
+      <w:r>
+        <w:rPr>
+          <w:lang w:eastAsia="zh-TW"/>
+        </w:rPr>
+        <w:t xml:space="preserve">                      </w:t>
+      </w:r>
+      <w:r>
+        <w:rPr>
+          <w:rFonts w:hint="eastAsia"/>
+          <w:lang w:eastAsia="zh-TW"/>
+        </w:rPr>
+        <w:t>0.2</w:t>
+      </w:r>
+      <w:r>
+        <w:rPr>
+          <w:rFonts w:hint="eastAsia"/>
+          <w:lang w:eastAsia="zh-TW"/>
+        </w:rPr>
+        <w:t>85714</w:t>
+      </w:r>
+    </w:p>
+    <w:p>
+      <w:pPr>
+        <w:rPr>
+          <w:rFonts w:hint="eastAsia"/>
           <w:lang w:eastAsia="zh-TW"/>
         </w:rPr>
       </w:pPr>

</xml_diff>